<commit_message>
ER diagram and system description
</commit_message>
<xml_diff>
--- a/ІО-41_Лозінська_Лаб1.docx
+++ b/ІО-41_Лозінська_Лаб1.docx
@@ -4,741 +4,653 @@
   <w:body>
     <w:p>
       <w:pPr>
-        <w:spacing w:after="60" w:line="256" w:lineRule="auto"/>
-        <w:ind w:left="1512" w:right="39" w:hanging="10"/>
-        <w:rPr>
-          <w:rFonts w:eastAsia="Times New Roman"/>
-          <w:lang w:bidi="he-IL"/>
-        </w:rPr>
-      </w:pPr>
-      <w:r>
-        <w:rPr>
-          <w:rFonts w:eastAsia="Times New Roman"/>
-          <w:sz w:val="32"/>
-          <w:lang w:bidi="he-IL"/>
-        </w:rPr>
-        <w:t xml:space="preserve">Національний технічний університет України </w:t>
+        <w:spacing w:line="256" w:lineRule="auto"/>
+        <w:rPr>
+          <w:rFonts w:eastAsia="Times New Roman"/>
+          <w:b/>
+          <w:sz w:val="44"/>
+          <w:szCs w:val="44"/>
+          <w:lang w:bidi="he-IL"/>
+        </w:rPr>
+      </w:pPr>
+      <w:r>
+        <w:rPr>
+          <w:rFonts w:eastAsia="Times New Roman"/>
+          <w:b/>
+          <w:sz w:val="44"/>
+          <w:szCs w:val="44"/>
+          <w:lang w:bidi="he-IL"/>
+        </w:rPr>
+        <w:t>Організація баз даних</w:t>
       </w:r>
     </w:p>
     <w:p>
       <w:pPr>
-        <w:spacing w:after="60" w:line="256" w:lineRule="auto"/>
-        <w:ind w:left="516" w:right="39" w:hanging="10"/>
-        <w:rPr>
-          <w:rFonts w:eastAsia="Times New Roman"/>
-          <w:lang w:bidi="he-IL"/>
-        </w:rPr>
-      </w:pPr>
-      <w:r>
-        <w:rPr>
-          <w:rFonts w:eastAsia="Times New Roman"/>
-          <w:sz w:val="32"/>
-          <w:lang w:bidi="he-IL"/>
-        </w:rPr>
-        <w:t xml:space="preserve">«Київський політехнічний інститут імені Ігоря Сікорського» </w:t>
+        <w:spacing w:line="256" w:lineRule="auto"/>
+        <w:rPr>
+          <w:rFonts w:eastAsia="Times New Roman"/>
+          <w:bCs/>
+          <w:sz w:val="36"/>
+          <w:szCs w:val="36"/>
+          <w:lang w:bidi="he-IL"/>
+        </w:rPr>
+      </w:pPr>
+      <w:r>
+        <w:rPr>
+          <w:rFonts w:eastAsia="Times New Roman"/>
+          <w:bCs/>
+          <w:sz w:val="36"/>
+          <w:szCs w:val="36"/>
+          <w:lang w:bidi="he-IL"/>
+        </w:rPr>
+        <w:t>Лабораторна робота 1</w:t>
       </w:r>
     </w:p>
     <w:p>
       <w:pPr>
-        <w:spacing w:after="149" w:line="256" w:lineRule="auto"/>
-        <w:ind w:left="2391" w:right="39" w:hanging="1241"/>
-        <w:rPr>
-          <w:rFonts w:eastAsia="Times New Roman"/>
-          <w:lang w:bidi="he-IL"/>
-        </w:rPr>
-      </w:pPr>
-      <w:r>
-        <w:rPr>
-          <w:rFonts w:eastAsia="Times New Roman"/>
-          <w:sz w:val="32"/>
-          <w:lang w:bidi="he-IL"/>
-        </w:rPr>
-        <w:t xml:space="preserve">Факультет інформатики та обчислювальної техніки Кафедра обчислювальної техніки </w:t>
+        <w:spacing w:line="256" w:lineRule="auto"/>
+        <w:rPr>
+          <w:rFonts w:eastAsia="Times New Roman"/>
+          <w:bCs/>
+          <w:lang w:bidi="he-IL"/>
+        </w:rPr>
+      </w:pPr>
+      <w:r>
+        <w:rPr>
+          <w:rFonts w:eastAsia="Times New Roman"/>
+          <w:bCs/>
+          <w:lang w:bidi="he-IL"/>
+        </w:rPr>
+        <w:t>Електронна шафа</w:t>
       </w:r>
     </w:p>
     <w:p>
       <w:pPr>
-        <w:spacing w:after="157" w:line="256" w:lineRule="auto"/>
-        <w:ind w:right="55"/>
-        <w:jc w:val="center"/>
-        <w:rPr>
-          <w:rFonts w:eastAsia="Times New Roman"/>
-          <w:lang w:bidi="he-IL"/>
-        </w:rPr>
-      </w:pPr>
-      <w:r>
-        <w:rPr>
-          <w:rFonts w:eastAsia="Times New Roman"/>
-          <w:sz w:val="32"/>
-          <w:lang w:bidi="he-IL"/>
-        </w:rPr>
-        <w:t xml:space="preserve"> </w:t>
+        <w:spacing w:line="256" w:lineRule="auto"/>
+        <w:rPr>
+          <w:rFonts w:eastAsia="Times New Roman"/>
+          <w:bCs/>
+          <w:lang w:bidi="he-IL"/>
+        </w:rPr>
+      </w:pPr>
+      <w:r>
+        <w:rPr>
+          <w:rFonts w:eastAsia="Times New Roman"/>
+          <w:bCs/>
+          <w:lang w:bidi="he-IL"/>
+        </w:rPr>
+        <w:t xml:space="preserve">У кожного хоча б раз у житті виникала проблема знайти щось у шафі. Особливо це відчутно, коли дуже поспішаєш і потрібно відшукати ту саму річ серед багатьох інших. Цю проблему вирішує електронна шафа, яка за допомогою власної бази даних та внутрішнього механізму за запитом користувача вказує точне місце розташування потрібної речі </w:t>
+      </w:r>
+      <w:r>
+        <w:rPr>
+          <w:rFonts w:eastAsia="Times New Roman"/>
+          <w:bCs/>
+          <w:lang w:bidi="he-IL"/>
+        </w:rPr>
+        <w:t>-</w:t>
+      </w:r>
+      <w:r>
+        <w:rPr>
+          <w:rFonts w:eastAsia="Times New Roman"/>
+          <w:bCs/>
+          <w:lang w:bidi="he-IL"/>
+        </w:rPr>
+        <w:t xml:space="preserve"> як на складі. Таким чином вона економить багато часу та нервів.</w:t>
       </w:r>
     </w:p>
     <w:p>
       <w:pPr>
-        <w:spacing w:after="157" w:line="256" w:lineRule="auto"/>
-        <w:ind w:right="55"/>
-        <w:jc w:val="center"/>
-        <w:rPr>
-          <w:rFonts w:eastAsia="Times New Roman"/>
-          <w:lang w:bidi="he-IL"/>
-        </w:rPr>
-      </w:pPr>
-      <w:r>
-        <w:rPr>
-          <w:rFonts w:eastAsia="Times New Roman"/>
-          <w:sz w:val="32"/>
-          <w:lang w:bidi="he-IL"/>
-        </w:rPr>
-        <w:t xml:space="preserve"> </w:t>
-      </w:r>
+        <w:spacing w:line="256" w:lineRule="auto"/>
+        <w:rPr>
+          <w:rFonts w:eastAsia="Times New Roman"/>
+          <w:bCs/>
+          <w:sz w:val="36"/>
+          <w:szCs w:val="36"/>
+          <w:lang w:bidi="he-IL"/>
+        </w:rPr>
+      </w:pPr>
     </w:p>
     <w:p>
       <w:pPr>
-        <w:spacing w:after="157" w:line="256" w:lineRule="auto"/>
-        <w:ind w:right="55"/>
-        <w:jc w:val="center"/>
-        <w:rPr>
-          <w:rFonts w:eastAsia="Times New Roman"/>
-          <w:lang w:bidi="he-IL"/>
-        </w:rPr>
-      </w:pPr>
-      <w:r>
-        <w:rPr>
-          <w:rFonts w:eastAsia="Times New Roman"/>
-          <w:sz w:val="32"/>
-          <w:lang w:bidi="he-IL"/>
-        </w:rPr>
-        <w:t xml:space="preserve"> </w:t>
+        <w:spacing w:line="256" w:lineRule="auto"/>
+        <w:rPr>
+          <w:rFonts w:eastAsia="Times New Roman"/>
+          <w:bCs/>
+          <w:sz w:val="36"/>
+          <w:szCs w:val="36"/>
+          <w:lang w:val="ru-RU" w:bidi="he-IL"/>
+        </w:rPr>
+      </w:pPr>
+      <w:r>
+        <w:rPr>
+          <w:rFonts w:eastAsia="Times New Roman"/>
+          <w:bCs/>
+          <w:sz w:val="36"/>
+          <w:szCs w:val="36"/>
+          <w:lang w:bidi="he-IL"/>
+        </w:rPr>
+        <w:t>Вимоги</w:t>
       </w:r>
     </w:p>
     <w:p>
       <w:pPr>
-        <w:spacing w:after="367" w:line="256" w:lineRule="auto"/>
-        <w:ind w:right="55"/>
-        <w:jc w:val="center"/>
-        <w:rPr>
-          <w:rFonts w:eastAsia="Times New Roman"/>
-          <w:lang w:bidi="he-IL"/>
-        </w:rPr>
-      </w:pPr>
-      <w:r>
-        <w:rPr>
-          <w:rFonts w:eastAsia="Times New Roman"/>
-          <w:sz w:val="32"/>
-          <w:lang w:bidi="he-IL"/>
-        </w:rPr>
-        <w:t xml:space="preserve"> </w:t>
+        <w:spacing w:line="256" w:lineRule="auto"/>
+        <w:rPr>
+          <w:rFonts w:eastAsia="Times New Roman"/>
+          <w:bCs/>
+          <w:lang w:bidi="he-IL"/>
+        </w:rPr>
+      </w:pPr>
+      <w:r>
+        <w:rPr>
+          <w:rFonts w:eastAsia="Times New Roman"/>
+          <w:bCs/>
+          <w:lang w:bidi="he-IL"/>
+        </w:rPr>
+        <w:t>Потреби зацікавлених сторін: Електронна шафа призначена для зберігання та обробки даних про об’єкти що зберігаються у шафі. Вид об’єктів не обмежений.</w:t>
       </w:r>
     </w:p>
     <w:p>
       <w:pPr>
-        <w:spacing w:after="2" w:line="256" w:lineRule="auto"/>
-        <w:ind w:left="2261"/>
-        <w:rPr>
-          <w:rFonts w:eastAsia="Times New Roman"/>
-          <w:lang w:bidi="he-IL"/>
-        </w:rPr>
-      </w:pPr>
-      <w:r>
-        <w:rPr>
-          <w:rFonts w:eastAsia="Times New Roman"/>
-          <w:b/>
-          <w:sz w:val="44"/>
-          <w:lang w:bidi="he-IL"/>
-        </w:rPr>
-        <w:t>Лабораторна робота №</w:t>
-      </w:r>
-      <w:r>
-        <w:rPr>
-          <w:rFonts w:eastAsia="Times New Roman"/>
-          <w:b/>
-          <w:sz w:val="44"/>
-          <w:lang w:val="ru-RU" w:bidi="he-IL"/>
-        </w:rPr>
-        <w:t>1</w:t>
-      </w:r>
-      <w:r>
-        <w:rPr>
-          <w:rFonts w:eastAsia="Times New Roman"/>
-          <w:b/>
-          <w:sz w:val="44"/>
-          <w:lang w:bidi="he-IL"/>
-        </w:rPr>
-        <w:t xml:space="preserve"> </w:t>
+        <w:spacing w:line="256" w:lineRule="auto"/>
+        <w:rPr>
+          <w:rFonts w:eastAsia="Times New Roman"/>
+          <w:bCs/>
+          <w:lang w:bidi="he-IL"/>
+        </w:rPr>
+      </w:pPr>
+      <w:r>
+        <w:rPr>
+          <w:rFonts w:eastAsia="Times New Roman"/>
+          <w:bCs/>
+          <w:lang w:bidi="he-IL"/>
+        </w:rPr>
+        <w:t>Основна зацікавлена сторона: власник шафи</w:t>
       </w:r>
     </w:p>
     <w:p>
       <w:pPr>
-        <w:spacing w:after="153" w:line="256" w:lineRule="auto"/>
-        <w:ind w:left="2031" w:right="129" w:hanging="10"/>
-        <w:rPr>
-          <w:rFonts w:eastAsia="Times New Roman"/>
-          <w:lang w:bidi="he-IL"/>
-        </w:rPr>
-      </w:pPr>
-      <w:r>
-        <w:rPr>
-          <w:rFonts w:eastAsia="Times New Roman"/>
-          <w:lang w:bidi="he-IL"/>
-        </w:rPr>
-        <w:t>з дисципліни «</w:t>
-      </w:r>
-      <w:r>
-        <w:rPr>
-          <w:rFonts w:eastAsia="Times New Roman"/>
-          <w:lang w:bidi="he-IL"/>
-        </w:rPr>
-        <w:t>Організація баз даних</w:t>
-      </w:r>
-      <w:r>
-        <w:rPr>
-          <w:rFonts w:eastAsia="Times New Roman"/>
-          <w:lang w:bidi="he-IL"/>
-        </w:rPr>
-        <w:t xml:space="preserve">» на тему </w:t>
+        <w:spacing w:line="256" w:lineRule="auto"/>
+        <w:rPr>
+          <w:rFonts w:eastAsia="Times New Roman"/>
+          <w:bCs/>
+          <w:lang w:bidi="he-IL"/>
+        </w:rPr>
+      </w:pPr>
+      <w:r>
+        <w:rPr>
+          <w:rFonts w:eastAsia="Times New Roman"/>
+          <w:bCs/>
+          <w:lang w:bidi="he-IL"/>
+        </w:rPr>
+        <w:t xml:space="preserve">Система зберігає: </w:t>
+      </w:r>
+      <w:r>
+        <w:rPr>
+          <w:rFonts w:eastAsia="Times New Roman"/>
+          <w:bCs/>
+          <w:lang w:bidi="he-IL"/>
+        </w:rPr>
+        <w:t>Шафу, Поличку, Відділення, Об’єкт, Джерело</w:t>
       </w:r>
     </w:p>
     <w:p>
       <w:pPr>
-        <w:spacing w:after="155" w:line="256" w:lineRule="auto"/>
-        <w:ind w:right="64"/>
-        <w:jc w:val="center"/>
-        <w:rPr>
-          <w:rFonts w:eastAsia="Times New Roman"/>
-          <w:lang w:bidi="he-IL"/>
-        </w:rPr>
-      </w:pPr>
-      <w:r>
-        <w:rPr>
-          <w:rFonts w:eastAsia="Times New Roman"/>
-          <w:b/>
-          <w:sz w:val="44"/>
-          <w:lang w:bidi="he-IL"/>
-        </w:rPr>
-        <w:t>ЗБІР ВИМОГ ТА РОЗРОБКА СХЕМИ ER</w:t>
-      </w:r>
-      <w:r>
-        <w:rPr>
-          <w:rFonts w:eastAsia="Times New Roman"/>
+        <w:spacing w:line="256" w:lineRule="auto"/>
+        <w:rPr>
+          <w:rFonts w:eastAsia="Times New Roman"/>
+          <w:bCs/>
+          <w:lang w:val="en-US" w:bidi="he-IL"/>
+        </w:rPr>
+      </w:pPr>
+      <w:r>
+        <w:rPr>
+          <w:rFonts w:eastAsia="Times New Roman"/>
+          <w:bCs/>
+          <w:lang w:bidi="he-IL"/>
+        </w:rPr>
+        <w:t>Атрибути шафи:</w:t>
+      </w:r>
+      <w:r>
+        <w:rPr>
+          <w:rFonts w:eastAsia="Times New Roman"/>
+          <w:bCs/>
           <w:lang w:bidi="he-IL"/>
         </w:rPr>
         <w:t xml:space="preserve"> </w:t>
+      </w:r>
+      <w:proofErr w:type="spellStart"/>
+      <w:r>
+        <w:rPr>
+          <w:rFonts w:eastAsia="Times New Roman"/>
+          <w:bCs/>
+          <w:lang w:val="en-US" w:bidi="he-IL"/>
+        </w:rPr>
+        <w:t>cupboard_id</w:t>
+      </w:r>
+      <w:proofErr w:type="spellEnd"/>
+      <w:r>
+        <w:rPr>
+          <w:rFonts w:eastAsia="Times New Roman"/>
+          <w:bCs/>
+          <w:lang w:val="en-US" w:bidi="he-IL"/>
+        </w:rPr>
+        <w:t xml:space="preserve">, </w:t>
+      </w:r>
+      <w:proofErr w:type="spellStart"/>
+      <w:r>
+        <w:rPr>
+          <w:rFonts w:eastAsia="Times New Roman"/>
+          <w:bCs/>
+          <w:lang w:val="en-US" w:bidi="he-IL"/>
+        </w:rPr>
+        <w:t>shelf_id</w:t>
+      </w:r>
+      <w:proofErr w:type="spellEnd"/>
+      <w:r>
+        <w:rPr>
+          <w:rFonts w:eastAsia="Times New Roman"/>
+          <w:bCs/>
+          <w:lang w:val="en-US" w:bidi="he-IL"/>
+        </w:rPr>
+        <w:t>, name, description, size, access</w:t>
       </w:r>
     </w:p>
     <w:p>
       <w:pPr>
-        <w:spacing w:after="157" w:line="256" w:lineRule="auto"/>
-        <w:ind w:right="64"/>
-        <w:jc w:val="center"/>
-        <w:rPr>
-          <w:rFonts w:eastAsia="Times New Roman"/>
-          <w:lang w:bidi="he-IL"/>
-        </w:rPr>
-      </w:pPr>
-      <w:r>
-        <w:rPr>
-          <w:rFonts w:eastAsia="Times New Roman"/>
-          <w:lang w:bidi="he-IL"/>
+        <w:spacing w:line="256" w:lineRule="auto"/>
+        <w:rPr>
+          <w:rFonts w:eastAsia="Times New Roman"/>
+          <w:bCs/>
+          <w:lang w:val="en-US" w:bidi="he-IL"/>
+        </w:rPr>
+      </w:pPr>
+      <w:r>
+        <w:rPr>
+          <w:rFonts w:eastAsia="Times New Roman"/>
+          <w:bCs/>
+          <w:lang w:bidi="he-IL"/>
+        </w:rPr>
+        <w:t>Атрибути полички:</w:t>
+      </w:r>
+      <w:r>
+        <w:rPr>
+          <w:rFonts w:eastAsia="Times New Roman"/>
+          <w:bCs/>
+          <w:lang w:val="en-US" w:bidi="he-IL"/>
         </w:rPr>
         <w:t xml:space="preserve"> </w:t>
+      </w:r>
+      <w:proofErr w:type="spellStart"/>
+      <w:r>
+        <w:rPr>
+          <w:rFonts w:eastAsia="Times New Roman"/>
+          <w:bCs/>
+          <w:lang w:val="en-US" w:bidi="he-IL"/>
+        </w:rPr>
+        <w:t>shelf_id</w:t>
+      </w:r>
+      <w:proofErr w:type="spellEnd"/>
+      <w:r>
+        <w:rPr>
+          <w:rFonts w:eastAsia="Times New Roman"/>
+          <w:bCs/>
+          <w:lang w:val="en-US" w:bidi="he-IL"/>
+        </w:rPr>
+        <w:t xml:space="preserve">, </w:t>
+      </w:r>
+      <w:proofErr w:type="spellStart"/>
+      <w:r>
+        <w:rPr>
+          <w:rFonts w:eastAsia="Times New Roman"/>
+          <w:bCs/>
+          <w:lang w:val="en-US" w:bidi="he-IL"/>
+        </w:rPr>
+        <w:t>cell_id</w:t>
+      </w:r>
+      <w:proofErr w:type="spellEnd"/>
+      <w:r>
+        <w:rPr>
+          <w:rFonts w:eastAsia="Times New Roman"/>
+          <w:bCs/>
+          <w:lang w:val="en-US" w:bidi="he-IL"/>
+        </w:rPr>
+        <w:t>, name, size, access</w:t>
       </w:r>
     </w:p>
     <w:p>
       <w:pPr>
-        <w:spacing w:after="155" w:line="256" w:lineRule="auto"/>
-        <w:ind w:right="64"/>
-        <w:jc w:val="center"/>
-        <w:rPr>
-          <w:rFonts w:eastAsia="Times New Roman"/>
-          <w:lang w:val="en-US" w:bidi="he-IL"/>
-        </w:rPr>
-      </w:pPr>
-      <w:r>
-        <w:rPr>
-          <w:rFonts w:eastAsia="Times New Roman"/>
-          <w:lang w:bidi="he-IL"/>
+        <w:spacing w:line="256" w:lineRule="auto"/>
+        <w:rPr>
+          <w:rFonts w:eastAsia="Times New Roman"/>
+          <w:bCs/>
+          <w:lang w:val="en-US" w:bidi="he-IL"/>
+        </w:rPr>
+      </w:pPr>
+      <w:r>
+        <w:rPr>
+          <w:rFonts w:eastAsia="Times New Roman"/>
+          <w:bCs/>
+          <w:lang w:bidi="he-IL"/>
+        </w:rPr>
+        <w:t>Атрибути відділення:</w:t>
+      </w:r>
+      <w:r>
+        <w:rPr>
+          <w:rFonts w:eastAsia="Times New Roman"/>
+          <w:bCs/>
+          <w:lang w:val="en-US" w:bidi="he-IL"/>
         </w:rPr>
         <w:t xml:space="preserve"> </w:t>
+      </w:r>
+      <w:proofErr w:type="spellStart"/>
+      <w:r>
+        <w:rPr>
+          <w:rFonts w:eastAsia="Times New Roman"/>
+          <w:bCs/>
+          <w:lang w:val="en-US" w:bidi="he-IL"/>
+        </w:rPr>
+        <w:t>cell_id</w:t>
+      </w:r>
+      <w:proofErr w:type="spellEnd"/>
+      <w:r>
+        <w:rPr>
+          <w:rFonts w:eastAsia="Times New Roman"/>
+          <w:bCs/>
+          <w:lang w:val="en-US" w:bidi="he-IL"/>
+        </w:rPr>
+        <w:t xml:space="preserve">, </w:t>
+      </w:r>
+      <w:proofErr w:type="spellStart"/>
+      <w:r>
+        <w:rPr>
+          <w:rFonts w:eastAsia="Times New Roman"/>
+          <w:bCs/>
+          <w:lang w:val="en-US" w:bidi="he-IL"/>
+        </w:rPr>
+        <w:t>object_id</w:t>
+      </w:r>
+      <w:proofErr w:type="spellEnd"/>
+      <w:r>
+        <w:rPr>
+          <w:rFonts w:eastAsia="Times New Roman"/>
+          <w:bCs/>
+          <w:lang w:val="en-US" w:bidi="he-IL"/>
+        </w:rPr>
+        <w:t>, name, size, color</w:t>
       </w:r>
     </w:p>
     <w:p>
       <w:pPr>
-        <w:spacing w:after="157" w:line="256" w:lineRule="auto"/>
-        <w:ind w:right="64"/>
-        <w:jc w:val="center"/>
-        <w:rPr>
-          <w:rFonts w:eastAsia="Times New Roman"/>
-          <w:lang w:val="en-US" w:bidi="he-IL"/>
-        </w:rPr>
-      </w:pPr>
+        <w:spacing w:line="256" w:lineRule="auto"/>
+        <w:rPr>
+          <w:rFonts w:eastAsia="Times New Roman"/>
+          <w:bCs/>
+          <w:lang w:val="en-US" w:bidi="he-IL"/>
+        </w:rPr>
+      </w:pPr>
+      <w:r>
+        <w:rPr>
+          <w:rFonts w:eastAsia="Times New Roman"/>
+          <w:bCs/>
+          <w:lang w:bidi="he-IL"/>
+        </w:rPr>
+        <w:t>Атрибути об’єкту:</w:t>
+      </w:r>
+      <w:r>
+        <w:rPr>
+          <w:rFonts w:eastAsia="Times New Roman"/>
+          <w:bCs/>
+          <w:lang w:val="en-US" w:bidi="he-IL"/>
+        </w:rPr>
+        <w:t xml:space="preserve"> </w:t>
+      </w:r>
+      <w:proofErr w:type="spellStart"/>
+      <w:r>
+        <w:rPr>
+          <w:rFonts w:eastAsia="Times New Roman"/>
+          <w:bCs/>
+          <w:lang w:val="en-US" w:bidi="he-IL"/>
+        </w:rPr>
+        <w:t>object_id</w:t>
+      </w:r>
+      <w:proofErr w:type="spellEnd"/>
+      <w:r>
+        <w:rPr>
+          <w:rFonts w:eastAsia="Times New Roman"/>
+          <w:bCs/>
+          <w:lang w:val="en-US" w:bidi="he-IL"/>
+        </w:rPr>
+        <w:t xml:space="preserve">, </w:t>
+      </w:r>
+      <w:proofErr w:type="spellStart"/>
+      <w:r>
+        <w:rPr>
+          <w:rFonts w:eastAsia="Times New Roman"/>
+          <w:bCs/>
+          <w:lang w:val="en-US" w:bidi="he-IL"/>
+        </w:rPr>
+        <w:t>source_id</w:t>
+      </w:r>
+      <w:proofErr w:type="spellEnd"/>
+      <w:r>
+        <w:rPr>
+          <w:rFonts w:eastAsia="Times New Roman"/>
+          <w:bCs/>
+          <w:lang w:val="en-US" w:bidi="he-IL"/>
+        </w:rPr>
+        <w:t>, name, description, count, weight, size</w:t>
+      </w:r>
     </w:p>
     <w:p>
       <w:pPr>
-        <w:spacing w:after="207" w:line="256" w:lineRule="auto"/>
-        <w:ind w:right="64"/>
-        <w:jc w:val="center"/>
-        <w:rPr>
-          <w:rFonts w:eastAsia="Times New Roman"/>
-          <w:lang w:bidi="he-IL"/>
-        </w:rPr>
-      </w:pPr>
-      <w:r>
-        <w:rPr>
-          <w:rFonts w:eastAsia="Times New Roman"/>
-          <w:lang w:bidi="he-IL"/>
+        <w:spacing w:line="256" w:lineRule="auto"/>
+        <w:rPr>
+          <w:rFonts w:eastAsia="Times New Roman"/>
+          <w:bCs/>
+          <w:lang w:val="en-US" w:bidi="he-IL"/>
+        </w:rPr>
+      </w:pPr>
+      <w:r>
+        <w:rPr>
+          <w:rFonts w:eastAsia="Times New Roman"/>
+          <w:bCs/>
+          <w:lang w:bidi="he-IL"/>
+        </w:rPr>
+        <w:t>Атрибути джерела:</w:t>
+      </w:r>
+      <w:r>
+        <w:rPr>
+          <w:rFonts w:eastAsia="Times New Roman"/>
+          <w:bCs/>
+          <w:lang w:val="en-US" w:bidi="he-IL"/>
         </w:rPr>
         <w:t xml:space="preserve"> </w:t>
+      </w:r>
+      <w:proofErr w:type="spellStart"/>
+      <w:r>
+        <w:rPr>
+          <w:rFonts w:eastAsia="Times New Roman"/>
+          <w:bCs/>
+          <w:lang w:val="en-US" w:bidi="he-IL"/>
+        </w:rPr>
+        <w:t>source_id</w:t>
+      </w:r>
+      <w:proofErr w:type="spellEnd"/>
+      <w:r>
+        <w:rPr>
+          <w:rFonts w:eastAsia="Times New Roman"/>
+          <w:bCs/>
+          <w:lang w:val="en-US" w:bidi="he-IL"/>
+        </w:rPr>
+        <w:t>, name, description, link, picture, manufacture</w:t>
       </w:r>
     </w:p>
     <w:p>
       <w:pPr>
-        <w:spacing w:after="49" w:line="256" w:lineRule="auto"/>
-        <w:ind w:left="10" w:right="121" w:hanging="10"/>
-        <w:jc w:val="right"/>
-        <w:rPr>
-          <w:rFonts w:eastAsia="Times New Roman"/>
-          <w:lang w:bidi="he-IL"/>
-        </w:rPr>
-      </w:pPr>
-      <w:r>
-        <w:rPr>
-          <w:rFonts w:eastAsia="Times New Roman"/>
-          <w:lang w:bidi="he-IL"/>
-        </w:rPr>
-        <w:t xml:space="preserve">Виконала: </w:t>
-      </w:r>
+        <w:spacing w:line="256" w:lineRule="auto"/>
+        <w:rPr>
+          <w:rFonts w:eastAsia="Times New Roman"/>
+          <w:bCs/>
+          <w:lang w:bidi="he-IL"/>
+        </w:rPr>
+      </w:pPr>
     </w:p>
     <w:p>
       <w:pPr>
-        <w:spacing w:after="36" w:line="256" w:lineRule="auto"/>
-        <w:ind w:right="135"/>
-        <w:jc w:val="right"/>
-        <w:rPr>
-          <w:rFonts w:eastAsia="Times New Roman"/>
-          <w:lang w:bidi="he-IL"/>
-        </w:rPr>
-      </w:pPr>
-      <w:r>
-        <w:rPr>
-          <w:rFonts w:eastAsia="Times New Roman"/>
-          <w:i/>
-          <w:lang w:bidi="he-IL"/>
-        </w:rPr>
-        <w:t>Лозінська М.В.</w:t>
+        <w:spacing w:line="256" w:lineRule="auto"/>
+        <w:rPr>
+          <w:rFonts w:eastAsia="Times New Roman"/>
+          <w:bCs/>
+          <w:lang w:bidi="he-IL"/>
+        </w:rPr>
+      </w:pPr>
+      <w:r>
+        <w:rPr>
+          <w:rFonts w:eastAsia="Times New Roman"/>
+          <w:bCs/>
+          <w:lang w:bidi="he-IL"/>
+        </w:rPr>
+        <w:t xml:space="preserve">Бізнес-правила: </w:t>
       </w:r>
     </w:p>
     <w:p>
       <w:pPr>
-        <w:spacing w:after="49" w:line="256" w:lineRule="auto"/>
-        <w:ind w:left="10" w:right="121" w:hanging="10"/>
-        <w:jc w:val="right"/>
-        <w:rPr>
-          <w:rFonts w:eastAsia="Times New Roman"/>
-          <w:lang w:bidi="he-IL"/>
-        </w:rPr>
-      </w:pPr>
-      <w:r>
-        <w:rPr>
-          <w:rFonts w:eastAsia="Times New Roman"/>
-          <w:lang w:bidi="he-IL"/>
-        </w:rPr>
-        <w:t xml:space="preserve">Група ІО-41 </w:t>
+        <w:spacing w:line="256" w:lineRule="auto"/>
+        <w:rPr>
+          <w:rFonts w:eastAsia="Times New Roman"/>
+          <w:bCs/>
+          <w:lang w:bidi="he-IL"/>
+        </w:rPr>
+      </w:pPr>
+      <w:r>
+        <w:rPr>
+          <w:rFonts w:eastAsia="Times New Roman"/>
+          <w:bCs/>
+          <w:lang w:bidi="he-IL"/>
+        </w:rPr>
+        <w:t>У кожного предмету обов’язково має бути своє посилання та ім’я</w:t>
       </w:r>
     </w:p>
     <w:p>
       <w:pPr>
-        <w:spacing w:after="0" w:line="256" w:lineRule="auto"/>
-        <w:ind w:left="10" w:right="121" w:hanging="10"/>
-        <w:jc w:val="right"/>
-        <w:rPr>
-          <w:rFonts w:eastAsia="Times New Roman"/>
-          <w:lang w:bidi="he-IL"/>
-        </w:rPr>
-      </w:pPr>
-      <w:r>
-        <w:rPr>
-          <w:rFonts w:eastAsia="Times New Roman"/>
-          <w:lang w:bidi="he-IL"/>
-        </w:rPr>
-        <w:t>Залікова книжка №411</w:t>
-      </w:r>
-      <w:r>
-        <w:rPr>
-          <w:rFonts w:eastAsia="Times New Roman"/>
-          <w:lang w:val="ru-RU" w:bidi="he-IL"/>
-        </w:rPr>
-        <w:t>3</w:t>
-      </w:r>
-      <w:r>
-        <w:rPr>
-          <w:rFonts w:eastAsia="Times New Roman"/>
-          <w:lang w:bidi="he-IL"/>
-        </w:rPr>
-        <w:t xml:space="preserve"> </w:t>
+        <w:spacing w:line="256" w:lineRule="auto"/>
+        <w:rPr>
+          <w:rFonts w:eastAsia="Times New Roman"/>
+          <w:bCs/>
+          <w:lang w:bidi="he-IL"/>
+        </w:rPr>
+      </w:pPr>
+      <w:r>
+        <w:rPr>
+          <w:rFonts w:eastAsia="Times New Roman"/>
+          <w:bCs/>
+          <w:lang w:bidi="he-IL"/>
+        </w:rPr>
+        <w:t>В одному відділенні може лежати більше одного предмету</w:t>
       </w:r>
     </w:p>
     <w:p>
       <w:pPr>
-        <w:spacing w:after="51" w:line="256" w:lineRule="auto"/>
-        <w:ind w:right="65"/>
-        <w:jc w:val="right"/>
-        <w:rPr>
-          <w:rFonts w:eastAsia="Times New Roman"/>
-          <w:lang w:bidi="he-IL"/>
-        </w:rPr>
-      </w:pPr>
-      <w:r>
-        <w:rPr>
-          <w:rFonts w:eastAsia="Times New Roman"/>
-          <w:lang w:bidi="he-IL"/>
-        </w:rPr>
-        <w:t xml:space="preserve"> </w:t>
+        <w:spacing w:line="256" w:lineRule="auto"/>
+        <w:rPr>
+          <w:rFonts w:eastAsia="Times New Roman"/>
+          <w:bCs/>
+          <w:lang w:bidi="he-IL"/>
+        </w:rPr>
+      </w:pPr>
+      <w:r>
+        <w:rPr>
+          <w:rFonts w:eastAsia="Times New Roman"/>
+          <w:bCs/>
+          <w:lang w:bidi="he-IL"/>
+        </w:rPr>
+        <w:t xml:space="preserve">Розмір </w:t>
+      </w:r>
+      <w:r>
+        <w:rPr>
+          <w:rFonts w:eastAsia="Times New Roman"/>
+          <w:bCs/>
+          <w:lang w:bidi="he-IL"/>
+        </w:rPr>
+        <w:t>поличок</w:t>
+      </w:r>
+      <w:r>
+        <w:rPr>
+          <w:rFonts w:eastAsia="Times New Roman"/>
+          <w:bCs/>
+          <w:lang w:bidi="he-IL"/>
+        </w:rPr>
+        <w:t xml:space="preserve"> та відділень </w:t>
+      </w:r>
+      <w:r>
+        <w:rPr>
+          <w:rFonts w:eastAsia="Times New Roman"/>
+          <w:bCs/>
+          <w:lang w:bidi="he-IL"/>
+        </w:rPr>
+        <w:t>обмежені</w:t>
+      </w:r>
+      <w:r>
+        <w:rPr>
+          <w:rFonts w:eastAsia="Times New Roman"/>
+          <w:bCs/>
+          <w:lang w:bidi="he-IL"/>
+        </w:rPr>
+        <w:t xml:space="preserve"> лише розміром шафи</w:t>
       </w:r>
     </w:p>
     <w:p>
       <w:pPr>
-        <w:spacing w:after="155" w:line="256" w:lineRule="auto"/>
-        <w:ind w:left="10" w:right="121" w:hanging="10"/>
-        <w:jc w:val="right"/>
-        <w:rPr>
-          <w:rFonts w:eastAsia="Times New Roman"/>
-          <w:lang w:bidi="he-IL"/>
-        </w:rPr>
-      </w:pPr>
-      <w:r>
-        <w:rPr>
-          <w:rFonts w:eastAsia="Times New Roman"/>
-          <w:lang w:bidi="he-IL"/>
-        </w:rPr>
-        <w:t xml:space="preserve">Викладач Верба О.А. </w:t>
-      </w:r>
-    </w:p>
-    <w:p>
-      <w:pPr>
-        <w:spacing w:after="157" w:line="256" w:lineRule="auto"/>
-        <w:ind w:right="65"/>
-        <w:jc w:val="right"/>
-        <w:rPr>
-          <w:rFonts w:eastAsia="Times New Roman"/>
-          <w:lang w:bidi="he-IL"/>
-        </w:rPr>
-      </w:pPr>
-    </w:p>
-    <w:p>
-      <w:pPr>
-        <w:spacing w:after="157" w:line="256" w:lineRule="auto"/>
-        <w:ind w:right="65"/>
-        <w:jc w:val="right"/>
-        <w:rPr>
-          <w:rFonts w:eastAsia="Times New Roman"/>
-          <w:lang w:val="en-US" w:bidi="he-IL"/>
-        </w:rPr>
-      </w:pPr>
-    </w:p>
-    <w:p>
-      <w:pPr>
-        <w:spacing w:after="157" w:line="256" w:lineRule="auto"/>
-        <w:ind w:right="65"/>
-        <w:jc w:val="right"/>
-        <w:rPr>
-          <w:rFonts w:eastAsia="Times New Roman"/>
-          <w:lang w:val="en-US" w:bidi="he-IL"/>
-        </w:rPr>
-      </w:pPr>
-    </w:p>
-    <w:p>
-      <w:pPr>
-        <w:spacing w:after="157" w:line="256" w:lineRule="auto"/>
-        <w:ind w:right="65"/>
-        <w:jc w:val="right"/>
-        <w:rPr>
-          <w:rFonts w:eastAsia="Times New Roman"/>
-          <w:lang w:val="en-US" w:bidi="he-IL"/>
-        </w:rPr>
-      </w:pPr>
-    </w:p>
-    <w:p>
-      <w:pPr>
-        <w:spacing w:after="157" w:line="256" w:lineRule="auto"/>
-        <w:ind w:right="65"/>
-        <w:jc w:val="right"/>
-        <w:rPr>
-          <w:rFonts w:eastAsia="Times New Roman"/>
-          <w:lang w:bidi="he-IL"/>
-        </w:rPr>
-      </w:pPr>
-      <w:r>
-        <w:rPr>
-          <w:rFonts w:eastAsia="Times New Roman"/>
-          <w:lang w:bidi="he-IL"/>
-        </w:rPr>
-        <w:t xml:space="preserve"> </w:t>
-      </w:r>
-    </w:p>
-    <w:p>
-      <w:pPr>
-        <w:spacing w:after="155" w:line="256" w:lineRule="auto"/>
-        <w:ind w:right="65"/>
-        <w:jc w:val="right"/>
-        <w:rPr>
-          <w:rFonts w:eastAsia="Times New Roman"/>
-          <w:lang w:bidi="he-IL"/>
-        </w:rPr>
-      </w:pPr>
-      <w:r>
-        <w:rPr>
-          <w:rFonts w:eastAsia="Times New Roman"/>
-          <w:lang w:bidi="he-IL"/>
-        </w:rPr>
-        <w:t xml:space="preserve"> </w:t>
-      </w:r>
-    </w:p>
-    <w:p>
-      <w:pPr>
-        <w:spacing w:after="185" w:line="256" w:lineRule="auto"/>
-        <w:ind w:right="65"/>
-        <w:jc w:val="center"/>
-        <w:rPr>
-          <w:rFonts w:eastAsia="Times New Roman"/>
-          <w:lang w:val="ru-RU" w:bidi="he-IL"/>
-        </w:rPr>
-      </w:pPr>
-      <w:r>
-        <w:rPr>
-          <w:rFonts w:eastAsia="Times New Roman"/>
-          <w:lang w:bidi="he-IL"/>
-        </w:rPr>
-        <w:t>Київ – 202</w:t>
-      </w:r>
-      <w:r>
-        <w:rPr>
-          <w:rFonts w:eastAsia="Times New Roman"/>
-          <w:lang w:val="ru-RU" w:bidi="he-IL"/>
-        </w:rPr>
-        <w:t>6</w:t>
-      </w:r>
-    </w:p>
-    <w:p>
-      <w:pPr>
-        <w:spacing w:after="212" w:line="256" w:lineRule="auto"/>
-        <w:ind w:left="-5" w:right="129"/>
-        <w:rPr>
-          <w:rFonts w:eastAsia="Times New Roman"/>
-          <w:lang w:bidi="he-IL"/>
-        </w:rPr>
-      </w:pPr>
-      <w:r>
-        <w:rPr>
-          <w:rFonts w:eastAsia="Times New Roman"/>
-          <w:kern w:val="0"/>
-          <w:lang w:bidi="he-IL"/>
-          <w14:ligatures w14:val="none"/>
-        </w:rPr>
-        <w:br w:type="page"/>
-      </w:r>
-      <w:r>
-        <w:rPr>
-          <w:rFonts w:eastAsia="Times New Roman"/>
-          <w:b/>
-          <w:u w:val="single" w:color="000000"/>
+        <w:spacing w:line="256" w:lineRule="auto"/>
+        <w:rPr>
+          <w:rFonts w:eastAsia="Times New Roman"/>
+          <w:bCs/>
+          <w:lang w:bidi="he-IL"/>
+        </w:rPr>
+      </w:pPr>
+      <w:r>
+        <w:rPr>
+          <w:rFonts w:eastAsia="Times New Roman"/>
+          <w:bCs/>
           <w:lang w:bidi="he-IL"/>
         </w:rPr>
         <w:lastRenderedPageBreak/>
-        <w:t>Тема</w:t>
-      </w:r>
-      <w:r>
-        <w:rPr>
-          <w:rFonts w:eastAsia="Times New Roman"/>
-          <w:b/>
-          <w:lang w:bidi="he-IL"/>
-        </w:rPr>
-        <w:t>:</w:t>
-      </w:r>
-      <w:r>
-        <w:rPr>
-          <w:rFonts w:eastAsia="Times New Roman"/>
-          <w:lang w:bidi="he-IL"/>
-        </w:rPr>
-        <w:t xml:space="preserve"> </w:t>
-      </w:r>
-      <w:r>
-        <w:rPr>
-          <w:rFonts w:eastAsia="Times New Roman"/>
-          <w:lang w:bidi="he-IL"/>
-        </w:rPr>
-        <w:t>з</w:t>
-      </w:r>
-      <w:r>
-        <w:rPr>
-          <w:rFonts w:eastAsia="Times New Roman"/>
-          <w:lang w:bidi="he-IL"/>
-        </w:rPr>
-        <w:t>бір вимог та розробка схеми ER</w:t>
-      </w:r>
-      <w:r>
-        <w:rPr>
-          <w:rFonts w:eastAsia="Times New Roman"/>
-          <w:lang w:bidi="he-IL"/>
-        </w:rPr>
-        <w:t>.</w:t>
-      </w:r>
-    </w:p>
-    <w:p>
-      <w:pPr>
-        <w:spacing w:line="256" w:lineRule="auto"/>
-        <w:rPr>
-          <w:rFonts w:eastAsia="Times New Roman"/>
-          <w:b/>
-          <w:lang w:bidi="he-IL"/>
-        </w:rPr>
-      </w:pPr>
-      <w:r>
-        <w:rPr>
-          <w:rFonts w:eastAsia="Times New Roman"/>
-          <w:b/>
-          <w:u w:val="single" w:color="000000"/>
-          <w:lang w:bidi="he-IL"/>
-        </w:rPr>
-        <w:t>Мета</w:t>
-      </w:r>
-      <w:r>
-        <w:rPr>
-          <w:rFonts w:eastAsia="Times New Roman"/>
-          <w:b/>
-          <w:lang w:bidi="he-IL"/>
-        </w:rPr>
-        <w:t xml:space="preserve">: </w:t>
-      </w:r>
-    </w:p>
-    <w:p>
-      <w:pPr>
-        <w:pStyle w:val="ListParagraph"/>
-        <w:numPr>
-          <w:ilvl w:val="0"/>
-          <w:numId w:val="4"/>
-        </w:numPr>
-        <w:spacing w:line="256" w:lineRule="auto"/>
-        <w:rPr>
-          <w:rFonts w:eastAsia="Times New Roman"/>
-          <w:bCs/>
-          <w:lang w:bidi="he-IL"/>
-        </w:rPr>
-      </w:pPr>
-      <w:r>
-        <w:rPr>
-          <w:rFonts w:eastAsia="Times New Roman"/>
-          <w:bCs/>
-          <w:lang w:bidi="he-IL"/>
-        </w:rPr>
-        <w:t>Зрозуміти важливість збору та аналізу вимог у проектуванні баз даних.</w:t>
-      </w:r>
-    </w:p>
-    <w:p>
-      <w:pPr>
-        <w:numPr>
-          <w:ilvl w:val="0"/>
-          <w:numId w:val="4"/>
-        </w:numPr>
-        <w:spacing w:line="256" w:lineRule="auto"/>
-        <w:rPr>
-          <w:rFonts w:eastAsia="Times New Roman"/>
-          <w:bCs/>
-          <w:lang w:bidi="he-IL"/>
-        </w:rPr>
-      </w:pPr>
-      <w:r>
-        <w:rPr>
-          <w:rFonts w:eastAsia="Times New Roman"/>
-          <w:bCs/>
-          <w:lang w:bidi="he-IL"/>
-        </w:rPr>
-        <w:t>Отримати практичний досвіт інтерв'ювання зацікавлених сторін та документування функціональних вимог і вимог до даних.</w:t>
-      </w:r>
-    </w:p>
-    <w:p>
-      <w:pPr>
-        <w:numPr>
-          <w:ilvl w:val="0"/>
-          <w:numId w:val="4"/>
-        </w:numPr>
-        <w:spacing w:line="256" w:lineRule="auto"/>
-        <w:rPr>
-          <w:rFonts w:eastAsia="Times New Roman"/>
-          <w:bCs/>
-          <w:lang w:bidi="he-IL"/>
-        </w:rPr>
-      </w:pPr>
-      <w:r>
-        <w:rPr>
-          <w:rFonts w:eastAsia="Times New Roman"/>
-          <w:bCs/>
-          <w:lang w:bidi="he-IL"/>
-        </w:rPr>
-        <w:t xml:space="preserve">Навчитись ідентифікувати сутності, атрибути та зв'язки з вимог (знаходження </w:t>
-      </w:r>
-      <w:r>
-        <w:rPr>
-          <w:rFonts w:eastAsia="Times New Roman"/>
-          <w:bCs/>
-          <w:i/>
-          <w:iCs/>
-          <w:lang w:bidi="he-IL"/>
-        </w:rPr>
-        <w:t xml:space="preserve">ядер </w:t>
-      </w:r>
-      <w:r>
-        <w:rPr>
-          <w:rFonts w:eastAsia="Times New Roman"/>
-          <w:bCs/>
-          <w:lang w:bidi="he-IL"/>
-        </w:rPr>
-        <w:t>або іменників).</w:t>
-      </w:r>
-    </w:p>
-    <w:p>
-      <w:pPr>
-        <w:numPr>
-          <w:ilvl w:val="0"/>
-          <w:numId w:val="4"/>
-        </w:numPr>
-        <w:spacing w:line="256" w:lineRule="auto"/>
-        <w:rPr>
-          <w:rFonts w:eastAsia="Times New Roman"/>
-          <w:bCs/>
-          <w:lang w:bidi="he-IL"/>
-        </w:rPr>
-      </w:pPr>
-      <w:r>
-        <w:rPr>
-          <w:rFonts w:eastAsia="Times New Roman"/>
-          <w:bCs/>
-          <w:lang w:bidi="he-IL"/>
-        </w:rPr>
-        <w:t>Створити концептуальну ER-діаграму, яка моделює вимоги до даних.</w:t>
-      </w:r>
-    </w:p>
-    <w:p>
-      <w:pPr>
-        <w:numPr>
-          <w:ilvl w:val="0"/>
-          <w:numId w:val="4"/>
-        </w:numPr>
-        <w:spacing w:line="256" w:lineRule="auto"/>
-        <w:rPr>
-          <w:rFonts w:eastAsia="Times New Roman"/>
-          <w:bCs/>
-          <w:lang w:bidi="he-IL"/>
-        </w:rPr>
-      </w:pPr>
-      <w:r>
-        <w:rPr>
-          <w:rFonts w:eastAsia="Times New Roman"/>
-          <w:bCs/>
-          <w:lang w:bidi="he-IL"/>
-        </w:rPr>
-        <w:t>Підготуватись до наступних лабораторних робіт: реалізація моделі у вигляді таблиць PostgreSQL, написання SQL-запитів (OLTP/OLAP) та застосування нормалізації та міграцій.</w:t>
+        <w:drawing>
+          <wp:inline distT="0" distB="0" distL="0" distR="0" wp14:anchorId="3B1585DD" wp14:editId="2900B7F6">
+            <wp:extent cx="5731510" cy="5422900"/>
+            <wp:effectExtent l="0" t="0" r="2540" b="6350"/>
+            <wp:docPr id="1139586525" name="Picture 1"/>
+            <wp:cNvGraphicFramePr>
+              <a:graphicFrameLocks xmlns:a="http://schemas.openxmlformats.org/drawingml/2006/main" noChangeAspect="1"/>
+            </wp:cNvGraphicFramePr>
+            <a:graphic xmlns:a="http://schemas.openxmlformats.org/drawingml/2006/main">
+              <a:graphicData uri="http://schemas.openxmlformats.org/drawingml/2006/picture">
+                <pic:pic xmlns:pic="http://schemas.openxmlformats.org/drawingml/2006/picture">
+                  <pic:nvPicPr>
+                    <pic:cNvPr id="1139586525" name=""/>
+                    <pic:cNvPicPr/>
+                  </pic:nvPicPr>
+                  <pic:blipFill>
+                    <a:blip r:embed="rId5"/>
+                    <a:stretch>
+                      <a:fillRect/>
+                    </a:stretch>
+                  </pic:blipFill>
+                  <pic:spPr>
+                    <a:xfrm>
+                      <a:off x="0" y="0"/>
+                      <a:ext cx="5731510" cy="5422900"/>
+                    </a:xfrm>
+                    <a:prstGeom prst="rect">
+                      <a:avLst/>
+                    </a:prstGeom>
+                  </pic:spPr>
+                </pic:pic>
+              </a:graphicData>
+            </a:graphic>
+          </wp:inline>
+        </w:drawing>
       </w:r>
     </w:p>
     <w:p>
@@ -1220,15 +1132,6 @@
   </w:abstractNum>
   <w:num w:numId="1" w16cid:durableId="1959675108">
     <w:abstractNumId w:val="1"/>
-    <w:lvlOverride w:ilvl="0"/>
-    <w:lvlOverride w:ilvl="1"/>
-    <w:lvlOverride w:ilvl="2"/>
-    <w:lvlOverride w:ilvl="3"/>
-    <w:lvlOverride w:ilvl="4"/>
-    <w:lvlOverride w:ilvl="5"/>
-    <w:lvlOverride w:ilvl="6"/>
-    <w:lvlOverride w:ilvl="7"/>
-    <w:lvlOverride w:ilvl="8"/>
   </w:num>
   <w:num w:numId="2" w16cid:durableId="1714038081">
     <w:abstractNumId w:val="3"/>

</xml_diff>